<commit_message>
Case IQ Implementation Lead: rescored 83 after webhooks + batch imports confirmed; profile updated
Co-Authored-By: Claude Opus 5.5 <noreply@anthropic.com>
Claude-Session: https://claude.ai/code/session_01Tym7Ffe6DkggR3nyAN5h24
</commit_message>
<xml_diff>
--- a/applications/case-iq-implementation-lead/CaseIQ-ImplementationLead-Resume.docx
+++ b/applications/case-iq-implementation-lead/CaseIQ-ImplementationLead-Resume.docx
@@ -80,7 +80,7 @@
           <w:i w:val="0"/>
           <w:color w:val="1A1A1A"/>
         </w:rPr>
-        <w:t>Implementation and onboarding lead with 15+ years in B2B SaaS, professional-services software, and agency environments. Owned implementations from contract through configuration, training, and go-live at Wix (25+ launches a month at 110% of implementation targets) and scoped CRM/PSA implementations with API integrations at Accelo. Today I build the integrations myself, in Zapier, Make, and n8n with custom Python and JavaScript code steps, so I can translate customer requirements into configurations engineering can trust. Built compliance systems from scratch in a state-regulated business.</w:t>
+        <w:t>Implementation and onboarding lead with 15+ years in B2B SaaS, professional-services software, and agency environments. Owned implementations from contract through configuration, training, and go-live at Wix (25+ launches a month at 110% of implementation targets) and scoped CRM/PSA implementations with API integrations at Accelo. Today I build the integrations myself, with webhooks, batch data imports, and custom Python and JavaScript code steps in Zapier, Make, and n8n, so I can translate customer requirements into configurations engineering can trust. Built compliance systems from scratch in a state-regulated business.</w:t>
       </w:r>
     </w:p>
     <w:p>
@@ -201,7 +201,31 @@
           <w:i w:val="0"/>
           <w:color w:val="1A1A1A"/>
         </w:rPr>
-        <w:t>Build system integrations in Zapier, Make, and n8n, writing custom Python and JavaScript code steps in production workflows that connect client CRMs, CMS platforms, and third-party tools.</w:t>
+        <w:t>Build system integrations in Zapier, Make, n8n, and GoHighLevel using webhook triggers and custom Python and JavaScript code steps, connecting client CRMs, CMS platforms, and third-party tools in production.</w:t>
+      </w:r>
+    </w:p>
+    <w:p>
+      <w:pPr>
+        <w:spacing w:after="30"/>
+        <w:ind w:left="259" w:hanging="259"/>
+      </w:pPr>
+      <w:r>
+        <w:rPr>
+          <w:rFonts w:ascii="Calibri" w:hAnsi="Calibri"/>
+          <w:b w:val="0"/>
+          <w:i w:val="0"/>
+          <w:color w:val="163A5F"/>
+        </w:rPr>
+        <w:t xml:space="preserve">•  </w:t>
+      </w:r>
+      <w:r>
+        <w:rPr>
+          <w:rFonts w:ascii="Calibri" w:hAnsi="Calibri"/>
+          <w:b w:val="0"/>
+          <w:i w:val="0"/>
+          <w:color w:val="1A1A1A"/>
+        </w:rPr>
+        <w:t>Run batch/CSV data imports into GoHighLevel and other platforms, cleaning and mapping records to the target CRM's fields and lifecycle stages.</w:t>
       </w:r>
     </w:p>
     <w:p>
@@ -1130,7 +1154,7 @@
           <w:i w:val="0"/>
           <w:color w:val="1A1A1A"/>
         </w:rPr>
-        <w:t>API Integrations, Zapier / Make / n8n, Python &amp; JavaScript (automation code steps), SQL, CRM Data Hygiene</w:t>
+        <w:t>API Integrations, Webhooks, Batch / CSV Data Imports, Zapier / Make / n8n, Python &amp; JavaScript (automation code steps), SQL, CRM Data Hygiene</w:t>
       </w:r>
     </w:p>
     <w:p>

</xml_diff>